<commit_message>
Paper: MATLAB validation confirmed in MATLAB R2021a
Co-Authored-By: Claude Opus 5.5 <noreply@anthropic.com>
Claude-Session: https://claude.ai/code/session_01FcrrmkJTVMUBqnhfmaF7Pm
</commit_message>
<xml_diff>
--- a/paper/IREA_paper_draft.docx
+++ b/paper/IREA_paper_draft.docx
@@ -8625,7 +8625,7 @@
           <w:sz w:val="20"/>
           <w:szCs w:val="20"/>
         </w:rPr>
-        <w:t xml:space="preserve">The complete model (dispatch with EMS, two-machine dynamics, BESS secondary control, projection, rate limiter and clipping, the exported TD3 actor, and the metrics) was re-implemented independently in MATLAB code that runs without toolboxes. Twelve test scenarios with their exact wind and load noise sequences were re-simulated for the tuned fixed VSG, the projected VSG and a trained TD3 policy (Table VI, Fig. 6). The traces of both fixed controllers are bit-identical to the Python results, and the TD3 traces differ by at most 1.1×10</w:t>
+        <w:t xml:space="preserve">The complete model (dispatch with EMS, two-machine dynamics, BESS secondary control, projection, rate limiter and clipping, the exported TD3 actor, and the metrics) was re-implemented independently in MATLAB code (R2021a, no toolboxes required). Twelve test scenarios with their exact wind and load noise sequences were re-simulated for the tuned fixed VSG, the projected VSG and a trained TD3 policy (Table VI, Fig. 6). The traces of both fixed controllers are bit-identical to the Python results, and the TD3 traces differ by at most 1.1×10</w:t>
       </w:r>
       <w:r>
         <w:rPr>
@@ -9373,20 +9373,7 @@
           <w:sz w:val="17"/>
           <w:szCs w:val="17"/>
         </w:rPr>
-        <w:t xml:space="preserve">Computed with GNU Octave 8.4; </w:t>
-      </w:r>
-      <w:r>
-        <w:rPr>
-          <w:rFonts w:ascii="Times New Roman" w:cs="Times New Roman" w:eastAsia="Times New Roman" w:hAnsi="Times New Roman"/>
-          <w:b w:val="false"/>
-          <w:bCs w:val="false"/>
-          <w:i w:val="false"/>
-          <w:iCs w:val="false"/>
-          <w:sz w:val="20"/>
-          <w:szCs w:val="20"/>
-          <w:shd w:fill="FFFF00" w:color="auto" w:val="clear"/>
-        </w:rPr>
-        <w:t xml:space="preserve">[AUTHOR: re-run matlab/run_matlab_validation.m in MATLAB and state the release]</w:t>
+        <w:t xml:space="preserve">Computed with MATLAB R2021a (identical results with GNU Octave 8.4).</w:t>
       </w:r>
     </w:p>
     <w:p>

</xml_diff>